<commit_message>
Added Readme and link
</commit_message>
<xml_diff>
--- a/SME_Credit_AI_Project_Report.docx
+++ b/SME_Credit_AI_Project_Report.docx
@@ -8,6 +8,13 @@
       </w:pPr>
       <w:r>
         <w:t>SME Credit Scoring AI Platform – Case Study Analysis</w:t>
+      </w:r>
+      <w:r>
+        <w:br/>
+        <w:t xml:space="preserve">Link: </w:t>
+      </w:r>
+      <w:r>
+        <w:t>https://smedashboard.netlify.app/</w:t>
       </w:r>
     </w:p>
     <w:p>
@@ -24,8 +31,6 @@
       </w:r>
       <w:r>
         <w:br/>
-      </w:r>
-      <w:r>
         <w:t>20 financial institutions × 2,000 applications each = 40,000 applications per year.</w:t>
       </w:r>
       <w:r>

</xml_diff>